<commit_message>
fix(etiquetas): renombrar 'Con datos'→'Validado' y 'Datos · a revisión'→'En revisión' en dashboard, badges, filtros, KPIs, PDFs, síntesis y OG (pedido de Tellys)
</commit_message>
<xml_diff>
--- a/entregables/sintesis-por-ejes.docx
+++ b/entregables/sintesis-por-ejes.docx
@@ -60,7 +60,7 @@
           <w:color w:val="5D6B88"/>
           <w:sz w:val="18"/>
         </w:rPr>
-        <w:t>Nota: las comisiones marcadas «a revisión» corresponden a una línea base preliminar inferida, pendiente de validación; las marcadas «con datos» provienen de redacciones oficiales.</w:t>
+        <w:t>Nota: las comisiones marcadas «en revisión» corresponden a una línea base preliminar inferida, pendiente de validación; las marcadas «validado» provienen de redacciones oficiales.</w:t>
       </w:r>
     </w:p>
     <w:p/>
@@ -85,7 +85,7 @@
           <w:color w:val="5D6B88"/>
           <w:sz w:val="19"/>
         </w:rPr>
-        <w:t>Dimensión económica  ·  13 comisiones (2 con datos, 11 a revisión)</w:t>
+        <w:t>Dimensión económica  ·  13 comisiones (2 validadas, 11 en revisión)</w:t>
       </w:r>
     </w:p>
     <w:p>
@@ -281,7 +281,7 @@
           <w:color w:val="1B8A4B"/>
           <w:sz w:val="16"/>
         </w:rPr>
-        <w:t xml:space="preserve">  ● con datos</w:t>
+        <w:t xml:space="preserve">  ● validado</w:t>
       </w:r>
     </w:p>
     <w:p>
@@ -315,7 +315,7 @@
           <w:color w:val="1B8A4B"/>
           <w:sz w:val="16"/>
         </w:rPr>
-        <w:t xml:space="preserve">  ● con datos</w:t>
+        <w:t xml:space="preserve">  ● validado</w:t>
       </w:r>
     </w:p>
     <w:p>
@@ -349,7 +349,7 @@
           <w:color w:val="B8840E"/>
           <w:sz w:val="16"/>
         </w:rPr>
-        <w:t xml:space="preserve">  ○ a revisión</w:t>
+        <w:t xml:space="preserve">  ○ en revisión</w:t>
       </w:r>
     </w:p>
     <w:p>
@@ -383,7 +383,7 @@
           <w:color w:val="B8840E"/>
           <w:sz w:val="16"/>
         </w:rPr>
-        <w:t xml:space="preserve">  ○ a revisión</w:t>
+        <w:t xml:space="preserve">  ○ en revisión</w:t>
       </w:r>
     </w:p>
     <w:p>
@@ -417,7 +417,7 @@
           <w:color w:val="B8840E"/>
           <w:sz w:val="16"/>
         </w:rPr>
-        <w:t xml:space="preserve">  ○ a revisión</w:t>
+        <w:t xml:space="preserve">  ○ en revisión</w:t>
       </w:r>
     </w:p>
     <w:p>
@@ -451,7 +451,7 @@
           <w:color w:val="B8840E"/>
           <w:sz w:val="16"/>
         </w:rPr>
-        <w:t xml:space="preserve">  ○ a revisión</w:t>
+        <w:t xml:space="preserve">  ○ en revisión</w:t>
       </w:r>
     </w:p>
     <w:p>
@@ -485,7 +485,7 @@
           <w:color w:val="B8840E"/>
           <w:sz w:val="16"/>
         </w:rPr>
-        <w:t xml:space="preserve">  ○ a revisión</w:t>
+        <w:t xml:space="preserve">  ○ en revisión</w:t>
       </w:r>
     </w:p>
     <w:p>
@@ -519,7 +519,7 @@
           <w:color w:val="B8840E"/>
           <w:sz w:val="16"/>
         </w:rPr>
-        <w:t xml:space="preserve">  ○ a revisión</w:t>
+        <w:t xml:space="preserve">  ○ en revisión</w:t>
       </w:r>
     </w:p>
     <w:p>
@@ -553,7 +553,7 @@
           <w:color w:val="B8840E"/>
           <w:sz w:val="16"/>
         </w:rPr>
-        <w:t xml:space="preserve">  ○ a revisión</w:t>
+        <w:t xml:space="preserve">  ○ en revisión</w:t>
       </w:r>
     </w:p>
     <w:p>
@@ -587,7 +587,7 @@
           <w:color w:val="B8840E"/>
           <w:sz w:val="16"/>
         </w:rPr>
-        <w:t xml:space="preserve">  ○ a revisión</w:t>
+        <w:t xml:space="preserve">  ○ en revisión</w:t>
       </w:r>
     </w:p>
     <w:p>
@@ -621,7 +621,7 @@
           <w:color w:val="B8840E"/>
           <w:sz w:val="16"/>
         </w:rPr>
-        <w:t xml:space="preserve">  ○ a revisión</w:t>
+        <w:t xml:space="preserve">  ○ en revisión</w:t>
       </w:r>
     </w:p>
     <w:p>
@@ -655,7 +655,7 @@
           <w:color w:val="B8840E"/>
           <w:sz w:val="16"/>
         </w:rPr>
-        <w:t xml:space="preserve">  ○ a revisión</w:t>
+        <w:t xml:space="preserve">  ○ en revisión</w:t>
       </w:r>
     </w:p>
     <w:p>
@@ -689,7 +689,7 @@
           <w:color w:val="B8840E"/>
           <w:sz w:val="16"/>
         </w:rPr>
-        <w:t xml:space="preserve">  ○ a revisión</w:t>
+        <w:t xml:space="preserve">  ○ en revisión</w:t>
       </w:r>
     </w:p>
     <w:p>
@@ -726,7 +726,7 @@
           <w:color w:val="5D6B88"/>
           <w:sz w:val="19"/>
         </w:rPr>
-        <w:t>Dimensión económica  ·  18 comisiones (0 con datos, 18 a revisión)</w:t>
+        <w:t>Dimensión económica  ·  18 comisiones (0 validadas, 18 en revisión)</w:t>
       </w:r>
     </w:p>
     <w:p>
@@ -922,7 +922,7 @@
           <w:color w:val="B8840E"/>
           <w:sz w:val="16"/>
         </w:rPr>
-        <w:t xml:space="preserve">  ○ a revisión</w:t>
+        <w:t xml:space="preserve">  ○ en revisión</w:t>
       </w:r>
     </w:p>
     <w:p>
@@ -956,7 +956,7 @@
           <w:color w:val="B8840E"/>
           <w:sz w:val="16"/>
         </w:rPr>
-        <w:t xml:space="preserve">  ○ a revisión</w:t>
+        <w:t xml:space="preserve">  ○ en revisión</w:t>
       </w:r>
     </w:p>
     <w:p>
@@ -990,7 +990,7 @@
           <w:color w:val="B8840E"/>
           <w:sz w:val="16"/>
         </w:rPr>
-        <w:t xml:space="preserve">  ○ a revisión</w:t>
+        <w:t xml:space="preserve">  ○ en revisión</w:t>
       </w:r>
     </w:p>
     <w:p>
@@ -1024,7 +1024,7 @@
           <w:color w:val="B8840E"/>
           <w:sz w:val="16"/>
         </w:rPr>
-        <w:t xml:space="preserve">  ○ a revisión</w:t>
+        <w:t xml:space="preserve">  ○ en revisión</w:t>
       </w:r>
     </w:p>
     <w:p>
@@ -1058,7 +1058,7 @@
           <w:color w:val="B8840E"/>
           <w:sz w:val="16"/>
         </w:rPr>
-        <w:t xml:space="preserve">  ○ a revisión</w:t>
+        <w:t xml:space="preserve">  ○ en revisión</w:t>
       </w:r>
     </w:p>
     <w:p>
@@ -1092,7 +1092,7 @@
           <w:color w:val="B8840E"/>
           <w:sz w:val="16"/>
         </w:rPr>
-        <w:t xml:space="preserve">  ○ a revisión</w:t>
+        <w:t xml:space="preserve">  ○ en revisión</w:t>
       </w:r>
     </w:p>
     <w:p>
@@ -1126,7 +1126,7 @@
           <w:color w:val="B8840E"/>
           <w:sz w:val="16"/>
         </w:rPr>
-        <w:t xml:space="preserve">  ○ a revisión</w:t>
+        <w:t xml:space="preserve">  ○ en revisión</w:t>
       </w:r>
     </w:p>
     <w:p>
@@ -1160,7 +1160,7 @@
           <w:color w:val="B8840E"/>
           <w:sz w:val="16"/>
         </w:rPr>
-        <w:t xml:space="preserve">  ○ a revisión</w:t>
+        <w:t xml:space="preserve">  ○ en revisión</w:t>
       </w:r>
     </w:p>
     <w:p>
@@ -1194,7 +1194,7 @@
           <w:color w:val="B8840E"/>
           <w:sz w:val="16"/>
         </w:rPr>
-        <w:t xml:space="preserve">  ○ a revisión</w:t>
+        <w:t xml:space="preserve">  ○ en revisión</w:t>
       </w:r>
     </w:p>
     <w:p>
@@ -1228,7 +1228,7 @@
           <w:color w:val="B8840E"/>
           <w:sz w:val="16"/>
         </w:rPr>
-        <w:t xml:space="preserve">  ○ a revisión</w:t>
+        <w:t xml:space="preserve">  ○ en revisión</w:t>
       </w:r>
     </w:p>
     <w:p>
@@ -1262,7 +1262,7 @@
           <w:color w:val="B8840E"/>
           <w:sz w:val="16"/>
         </w:rPr>
-        <w:t xml:space="preserve">  ○ a revisión</w:t>
+        <w:t xml:space="preserve">  ○ en revisión</w:t>
       </w:r>
     </w:p>
     <w:p>
@@ -1296,7 +1296,7 @@
           <w:color w:val="B8840E"/>
           <w:sz w:val="16"/>
         </w:rPr>
-        <w:t xml:space="preserve">  ○ a revisión</w:t>
+        <w:t xml:space="preserve">  ○ en revisión</w:t>
       </w:r>
     </w:p>
     <w:p>
@@ -1330,7 +1330,7 @@
           <w:color w:val="B8840E"/>
           <w:sz w:val="16"/>
         </w:rPr>
-        <w:t xml:space="preserve">  ○ a revisión</w:t>
+        <w:t xml:space="preserve">  ○ en revisión</w:t>
       </w:r>
     </w:p>
     <w:p>
@@ -1364,7 +1364,7 @@
           <w:color w:val="B8840E"/>
           <w:sz w:val="16"/>
         </w:rPr>
-        <w:t xml:space="preserve">  ○ a revisión</w:t>
+        <w:t xml:space="preserve">  ○ en revisión</w:t>
       </w:r>
     </w:p>
     <w:p>
@@ -1398,7 +1398,7 @@
           <w:color w:val="B8840E"/>
           <w:sz w:val="16"/>
         </w:rPr>
-        <w:t xml:space="preserve">  ○ a revisión</w:t>
+        <w:t xml:space="preserve">  ○ en revisión</w:t>
       </w:r>
     </w:p>
     <w:p>
@@ -1432,7 +1432,7 @@
           <w:color w:val="B8840E"/>
           <w:sz w:val="16"/>
         </w:rPr>
-        <w:t xml:space="preserve">  ○ a revisión</w:t>
+        <w:t xml:space="preserve">  ○ en revisión</w:t>
       </w:r>
     </w:p>
     <w:p>
@@ -1466,7 +1466,7 @@
           <w:color w:val="B8840E"/>
           <w:sz w:val="16"/>
         </w:rPr>
-        <w:t xml:space="preserve">  ○ a revisión</w:t>
+        <w:t xml:space="preserve">  ○ en revisión</w:t>
       </w:r>
     </w:p>
     <w:p>
@@ -1500,7 +1500,7 @@
           <w:color w:val="B8840E"/>
           <w:sz w:val="16"/>
         </w:rPr>
-        <w:t xml:space="preserve">  ○ a revisión</w:t>
+        <w:t xml:space="preserve">  ○ en revisión</w:t>
       </w:r>
     </w:p>
     <w:p>
@@ -1537,7 +1537,7 @@
           <w:color w:val="5D6B88"/>
           <w:sz w:val="19"/>
         </w:rPr>
-        <w:t>Dimensión económica / territorial  ·  11 comisiones (3 con datos, 8 a revisión)</w:t>
+        <w:t>Dimensión económica / territorial  ·  11 comisiones (3 validadas, 8 en revisión)</w:t>
       </w:r>
     </w:p>
     <w:p>
@@ -1733,7 +1733,7 @@
           <w:color w:val="1B8A4B"/>
           <w:sz w:val="16"/>
         </w:rPr>
-        <w:t xml:space="preserve">  ● con datos</w:t>
+        <w:t xml:space="preserve">  ● validado</w:t>
       </w:r>
     </w:p>
     <w:p>
@@ -1767,7 +1767,7 @@
           <w:color w:val="1B8A4B"/>
           <w:sz w:val="16"/>
         </w:rPr>
-        <w:t xml:space="preserve">  ● con datos</w:t>
+        <w:t xml:space="preserve">  ● validado</w:t>
       </w:r>
     </w:p>
     <w:p>
@@ -1801,7 +1801,7 @@
           <w:color w:val="1B8A4B"/>
           <w:sz w:val="16"/>
         </w:rPr>
-        <w:t xml:space="preserve">  ● con datos</w:t>
+        <w:t xml:space="preserve">  ● validado</w:t>
       </w:r>
     </w:p>
     <w:p>
@@ -1835,7 +1835,7 @@
           <w:color w:val="B8840E"/>
           <w:sz w:val="16"/>
         </w:rPr>
-        <w:t xml:space="preserve">  ○ a revisión</w:t>
+        <w:t xml:space="preserve">  ○ en revisión</w:t>
       </w:r>
     </w:p>
     <w:p>
@@ -1869,7 +1869,7 @@
           <w:color w:val="B8840E"/>
           <w:sz w:val="16"/>
         </w:rPr>
-        <w:t xml:space="preserve">  ○ a revisión</w:t>
+        <w:t xml:space="preserve">  ○ en revisión</w:t>
       </w:r>
     </w:p>
     <w:p>
@@ -1903,7 +1903,7 @@
           <w:color w:val="B8840E"/>
           <w:sz w:val="16"/>
         </w:rPr>
-        <w:t xml:space="preserve">  ○ a revisión</w:t>
+        <w:t xml:space="preserve">  ○ en revisión</w:t>
       </w:r>
     </w:p>
     <w:p>
@@ -1937,7 +1937,7 @@
           <w:color w:val="B8840E"/>
           <w:sz w:val="16"/>
         </w:rPr>
-        <w:t xml:space="preserve">  ○ a revisión</w:t>
+        <w:t xml:space="preserve">  ○ en revisión</w:t>
       </w:r>
     </w:p>
     <w:p>
@@ -1971,7 +1971,7 @@
           <w:color w:val="B8840E"/>
           <w:sz w:val="16"/>
         </w:rPr>
-        <w:t xml:space="preserve">  ○ a revisión</w:t>
+        <w:t xml:space="preserve">  ○ en revisión</w:t>
       </w:r>
     </w:p>
     <w:p>
@@ -2005,7 +2005,7 @@
           <w:color w:val="B8840E"/>
           <w:sz w:val="16"/>
         </w:rPr>
-        <w:t xml:space="preserve">  ○ a revisión</w:t>
+        <w:t xml:space="preserve">  ○ en revisión</w:t>
       </w:r>
     </w:p>
     <w:p>
@@ -2039,7 +2039,7 @@
           <w:color w:val="B8840E"/>
           <w:sz w:val="16"/>
         </w:rPr>
-        <w:t xml:space="preserve">  ○ a revisión</w:t>
+        <w:t xml:space="preserve">  ○ en revisión</w:t>
       </w:r>
     </w:p>
     <w:p>
@@ -2073,7 +2073,7 @@
           <w:color w:val="B8840E"/>
           <w:sz w:val="16"/>
         </w:rPr>
-        <w:t xml:space="preserve">  ○ a revisión</w:t>
+        <w:t xml:space="preserve">  ○ en revisión</w:t>
       </w:r>
     </w:p>
     <w:p>
@@ -2110,7 +2110,7 @@
           <w:color w:val="5D6B88"/>
           <w:sz w:val="19"/>
         </w:rPr>
-        <w:t>Dimensión ambiental  ·  6 comisiones (1 con datos, 5 a revisión)</w:t>
+        <w:t>Dimensión ambiental  ·  6 comisiones (1 validadas, 5 en revisión)</w:t>
       </w:r>
     </w:p>
     <w:p>
@@ -2306,7 +2306,7 @@
           <w:color w:val="1B8A4B"/>
           <w:sz w:val="16"/>
         </w:rPr>
-        <w:t xml:space="preserve">  ● con datos</w:t>
+        <w:t xml:space="preserve">  ● validado</w:t>
       </w:r>
     </w:p>
     <w:p>
@@ -2340,7 +2340,7 @@
           <w:color w:val="B8840E"/>
           <w:sz w:val="16"/>
         </w:rPr>
-        <w:t xml:space="preserve">  ○ a revisión</w:t>
+        <w:t xml:space="preserve">  ○ en revisión</w:t>
       </w:r>
     </w:p>
     <w:p>
@@ -2374,7 +2374,7 @@
           <w:color w:val="B8840E"/>
           <w:sz w:val="16"/>
         </w:rPr>
-        <w:t xml:space="preserve">  ○ a revisión</w:t>
+        <w:t xml:space="preserve">  ○ en revisión</w:t>
       </w:r>
     </w:p>
     <w:p>
@@ -2408,7 +2408,7 @@
           <w:color w:val="B8840E"/>
           <w:sz w:val="16"/>
         </w:rPr>
-        <w:t xml:space="preserve">  ○ a revisión</w:t>
+        <w:t xml:space="preserve">  ○ en revisión</w:t>
       </w:r>
     </w:p>
     <w:p>
@@ -2442,7 +2442,7 @@
           <w:color w:val="B8840E"/>
           <w:sz w:val="16"/>
         </w:rPr>
-        <w:t xml:space="preserve">  ○ a revisión</w:t>
+        <w:t xml:space="preserve">  ○ en revisión</w:t>
       </w:r>
     </w:p>
     <w:p>
@@ -2476,7 +2476,7 @@
           <w:color w:val="B8840E"/>
           <w:sz w:val="16"/>
         </w:rPr>
-        <w:t xml:space="preserve">  ○ a revisión</w:t>
+        <w:t xml:space="preserve">  ○ en revisión</w:t>
       </w:r>
     </w:p>
     <w:p>
@@ -2513,7 +2513,7 @@
           <w:color w:val="5D6B88"/>
           <w:sz w:val="19"/>
         </w:rPr>
-        <w:t>Dimensión social  ·  9 comisiones (1 con datos, 8 a revisión)</w:t>
+        <w:t>Dimensión social  ·  9 comisiones (1 validadas, 8 en revisión)</w:t>
       </w:r>
     </w:p>
     <w:p>
@@ -2709,7 +2709,7 @@
           <w:color w:val="1B8A4B"/>
           <w:sz w:val="16"/>
         </w:rPr>
-        <w:t xml:space="preserve">  ● con datos</w:t>
+        <w:t xml:space="preserve">  ● validado</w:t>
       </w:r>
     </w:p>
     <w:p>
@@ -2743,7 +2743,7 @@
           <w:color w:val="B8840E"/>
           <w:sz w:val="16"/>
         </w:rPr>
-        <w:t xml:space="preserve">  ○ a revisión</w:t>
+        <w:t xml:space="preserve">  ○ en revisión</w:t>
       </w:r>
     </w:p>
     <w:p>
@@ -2777,7 +2777,7 @@
           <w:color w:val="B8840E"/>
           <w:sz w:val="16"/>
         </w:rPr>
-        <w:t xml:space="preserve">  ○ a revisión</w:t>
+        <w:t xml:space="preserve">  ○ en revisión</w:t>
       </w:r>
     </w:p>
     <w:p>
@@ -2811,7 +2811,7 @@
           <w:color w:val="B8840E"/>
           <w:sz w:val="16"/>
         </w:rPr>
-        <w:t xml:space="preserve">  ○ a revisión</w:t>
+        <w:t xml:space="preserve">  ○ en revisión</w:t>
       </w:r>
     </w:p>
     <w:p>
@@ -2845,7 +2845,7 @@
           <w:color w:val="B8840E"/>
           <w:sz w:val="16"/>
         </w:rPr>
-        <w:t xml:space="preserve">  ○ a revisión</w:t>
+        <w:t xml:space="preserve">  ○ en revisión</w:t>
       </w:r>
     </w:p>
     <w:p>
@@ -2879,7 +2879,7 @@
           <w:color w:val="B8840E"/>
           <w:sz w:val="16"/>
         </w:rPr>
-        <w:t xml:space="preserve">  ○ a revisión</w:t>
+        <w:t xml:space="preserve">  ○ en revisión</w:t>
       </w:r>
     </w:p>
     <w:p>
@@ -2913,7 +2913,7 @@
           <w:color w:val="B8840E"/>
           <w:sz w:val="16"/>
         </w:rPr>
-        <w:t xml:space="preserve">  ○ a revisión</w:t>
+        <w:t xml:space="preserve">  ○ en revisión</w:t>
       </w:r>
     </w:p>
     <w:p>
@@ -2947,7 +2947,7 @@
           <w:color w:val="B8840E"/>
           <w:sz w:val="16"/>
         </w:rPr>
-        <w:t xml:space="preserve">  ○ a revisión</w:t>
+        <w:t xml:space="preserve">  ○ en revisión</w:t>
       </w:r>
     </w:p>
     <w:p>
@@ -2981,7 +2981,7 @@
           <w:color w:val="B8840E"/>
           <w:sz w:val="16"/>
         </w:rPr>
-        <w:t xml:space="preserve">  ○ a revisión</w:t>
+        <w:t xml:space="preserve">  ○ en revisión</w:t>
       </w:r>
     </w:p>
     <w:p>
@@ -3018,7 +3018,7 @@
           <w:color w:val="5D6B88"/>
           <w:sz w:val="19"/>
         </w:rPr>
-        <w:t>Dimensión institucional / soberanía  ·  6 comisiones (1 con datos, 5 a revisión)</w:t>
+        <w:t>Dimensión institucional / soberanía  ·  6 comisiones (1 validadas, 5 en revisión)</w:t>
       </w:r>
     </w:p>
     <w:p>
@@ -3214,7 +3214,7 @@
           <w:color w:val="1B8A4B"/>
           <w:sz w:val="16"/>
         </w:rPr>
-        <w:t xml:space="preserve">  ● con datos</w:t>
+        <w:t xml:space="preserve">  ● validado</w:t>
       </w:r>
     </w:p>
     <w:p>
@@ -3248,7 +3248,7 @@
           <w:color w:val="B8840E"/>
           <w:sz w:val="16"/>
         </w:rPr>
-        <w:t xml:space="preserve">  ○ a revisión</w:t>
+        <w:t xml:space="preserve">  ○ en revisión</w:t>
       </w:r>
     </w:p>
     <w:p>
@@ -3282,7 +3282,7 @@
           <w:color w:val="B8840E"/>
           <w:sz w:val="16"/>
         </w:rPr>
-        <w:t xml:space="preserve">  ○ a revisión</w:t>
+        <w:t xml:space="preserve">  ○ en revisión</w:t>
       </w:r>
     </w:p>
     <w:p>
@@ -3316,7 +3316,7 @@
           <w:color w:val="B8840E"/>
           <w:sz w:val="16"/>
         </w:rPr>
-        <w:t xml:space="preserve">  ○ a revisión</w:t>
+        <w:t xml:space="preserve">  ○ en revisión</w:t>
       </w:r>
     </w:p>
     <w:p>
@@ -3350,7 +3350,7 @@
           <w:color w:val="B8840E"/>
           <w:sz w:val="16"/>
         </w:rPr>
-        <w:t xml:space="preserve">  ○ a revisión</w:t>
+        <w:t xml:space="preserve">  ○ en revisión</w:t>
       </w:r>
     </w:p>
     <w:p>
@@ -3384,7 +3384,7 @@
           <w:color w:val="B8840E"/>
           <w:sz w:val="16"/>
         </w:rPr>
-        <w:t xml:space="preserve">  ○ a revisión</w:t>
+        <w:t xml:space="preserve">  ○ en revisión</w:t>
       </w:r>
     </w:p>
     <w:p>

</xml_diff>